<commit_message>
Add role-based access controls
Introduce database-backed permissions and role management across the API and UI, while preserving MFA recovery after failed code attempts.

Co-authored-by: Cursor <cursoragent@cursor.com>
</commit_message>
<xml_diff>
--- a/Backend-Features-API-Reference.docx
+++ b/Backend-Features-API-Reference.docx
@@ -4986,7 +4986,7 @@
           <w:szCs w:val="20"/>
           <w:rFonts w:ascii="Calibri" w:cs="Calibri" w:eastAsia="Calibri" w:hAnsi="Calibri"/>
         </w:rPr>
-        <w:t xml:space="preserve">Lists all database-backed timeout/threshold settings for admins.</w:t>
+        <w:t xml:space="preserve">Lists all database-backed timeout/threshold settings for users with settings read access.</w:t>
       </w:r>
     </w:p>
     <w:tbl>
@@ -5092,7 +5092,7 @@
                 <w:szCs w:val="18"/>
                 <w:rFonts w:ascii="Calibri" w:cs="Calibri" w:eastAsia="Calibri" w:hAnsi="Calibri"/>
               </w:rPr>
-              <w:t xml:space="preserve">Authenticated admin session</w:t>
+              <w:t xml:space="preserve">settings:read permission</w:t>
             </w:r>
           </w:p>
         </w:tc>
@@ -5137,20 +5137,7 @@
           <w:szCs w:val="20"/>
           <w:rFonts w:ascii="Calibri" w:cs="Calibri" w:eastAsia="Calibri" w:hAnsi="Calibri"/>
         </w:rPr>
-        <w:t xml:space="preserve">• middleware/requireAuth.ts → requireAuth</w:t>
-      </w:r>
-    </w:p>
-    <w:p>
-      <w:pPr>
-        <w:spacing w:after="40"/>
-      </w:pPr>
-      <w:r>
-        <w:rPr>
-          <w:sz w:val="20"/>
-          <w:szCs w:val="20"/>
-          <w:rFonts w:ascii="Calibri" w:cs="Calibri" w:eastAsia="Calibri" w:hAnsi="Calibri"/>
-        </w:rPr>
-        <w:t xml:space="preserve">• middleware/requireAdmin.ts → requireAdmin</w:t>
+        <w:t xml:space="preserve">• middleware/requirePermission.ts → requirePermission</w:t>
       </w:r>
     </w:p>
     <w:p>
@@ -5393,20 +5380,20 @@
           <w:szCs w:val="20"/>
           <w:rFonts w:ascii="Calibri" w:cs="Calibri" w:eastAsia="Calibri" w:hAnsi="Calibri"/>
         </w:rPr>
-        <w:t xml:space="preserve">• 401 { "error": "Authentication required" }</w:t>
-      </w:r>
-    </w:p>
-    <w:p>
-      <w:pPr>
-        <w:spacing w:after="40"/>
-      </w:pPr>
-      <w:r>
-        <w:rPr>
-          <w:sz w:val="20"/>
-          <w:szCs w:val="20"/>
-          <w:rFonts w:ascii="Calibri" w:cs="Calibri" w:eastAsia="Calibri" w:hAnsi="Calibri"/>
-        </w:rPr>
-        <w:t xml:space="preserve">• 403 { "error": "Admin access required" }</w:t>
+        <w:t xml:space="preserve">• 401 { "error": "Authentication required", "code": "AUTHENTICATION_REQUIRED" }</w:t>
+      </w:r>
+    </w:p>
+    <w:p>
+      <w:pPr>
+        <w:spacing w:after="40"/>
+      </w:pPr>
+      <w:r>
+        <w:rPr>
+          <w:sz w:val="20"/>
+          <w:szCs w:val="20"/>
+          <w:rFonts w:ascii="Calibri" w:cs="Calibri" w:eastAsia="Calibri" w:hAnsi="Calibri"/>
+        </w:rPr>
+        <w:t xml:space="preserve">• 403 { "error": "Required permission is missing", "code": "FORBIDDEN" }</w:t>
       </w:r>
     </w:p>
     <w:p>
@@ -5541,7 +5528,7 @@
                 <w:szCs w:val="18"/>
                 <w:rFonts w:ascii="Calibri" w:cs="Calibri" w:eastAsia="Calibri" w:hAnsi="Calibri"/>
               </w:rPr>
-              <w:t xml:space="preserve">Authenticated admin + CSRF + recent auth</w:t>
+              <w:t xml:space="preserve">settings:update permission + CSRF + recent auth</w:t>
             </w:r>
           </w:p>
         </w:tc>
@@ -5777,7 +5764,7 @@
           <w:szCs w:val="20"/>
           <w:rFonts w:ascii="Calibri" w:cs="Calibri" w:eastAsia="Calibri" w:hAnsi="Calibri"/>
         </w:rPr>
-        <w:t xml:space="preserve">• 401 { "error": "Recent authentication required" }</w:t>
+        <w:t xml:space="preserve">• 401 { "error": "Recent authentication required", "code": "RECENT_AUTH_REQUIRED" }</w:t>
       </w:r>
     </w:p>
     <w:p>
@@ -5803,7 +5790,7 @@
           <w:szCs w:val="20"/>
           <w:rFonts w:ascii="Calibri" w:cs="Calibri" w:eastAsia="Calibri" w:hAnsi="Calibri"/>
         </w:rPr>
-        <w:t xml:space="preserve">• 403 { "error": "Admin access required" }</w:t>
+        <w:t xml:space="preserve">• 403 { "error": "Required permission is missing", "code": "FORBIDDEN" }</w:t>
       </w:r>
     </w:p>
     <w:p>
@@ -5819,7 +5806,1276 @@
           <w:szCs w:val="24"/>
           <w:rFonts w:ascii="Calibri" w:cs="Calibri" w:eastAsia="Calibri" w:hAnsi="Calibri"/>
         </w:rPr>
-        <w:t xml:space="preserve">16. Health check</w:t>
+        <w:t xml:space="preserve">16. User access (list)</w:t>
+      </w:r>
+    </w:p>
+    <w:p>
+      <w:pPr>
+        <w:spacing w:after="80"/>
+      </w:pPr>
+      <w:r>
+        <w:rPr>
+          <w:sz w:val="20"/>
+          <w:szCs w:val="20"/>
+          <w:rFonts w:ascii="Calibri" w:cs="Calibri" w:eastAsia="Calibri" w:hAnsi="Calibri"/>
+        </w:rPr>
+        <w:t xml:space="preserve">Searches users with bounded cursor pagination and returns their assigned fixed roles.</w:t>
+      </w:r>
+    </w:p>
+    <w:tbl>
+      <w:tblPr>
+        <w:tblW w:type="dxa" w:w="9360"/>
+        <w:tblBorders>
+          <w:top w:val="single" w:color="auto" w:sz="4"/>
+          <w:left w:val="single" w:color="auto" w:sz="4"/>
+          <w:bottom w:val="single" w:color="auto" w:sz="4"/>
+          <w:right w:val="single" w:color="auto" w:sz="4"/>
+          <w:insideH w:val="single" w:color="auto" w:sz="4"/>
+          <w:insideV w:val="single" w:color="auto" w:sz="4"/>
+        </w:tblBorders>
+      </w:tblPr>
+      <w:tblGrid>
+        <w:gridCol w:w="2800"/>
+        <w:gridCol w:w="6560"/>
+      </w:tblGrid>
+      <w:tr>
+        <w:tc>
+          <w:tcPr>
+            <w:tcW w:type="dxa" w:w="2800"/>
+            <w:tcBorders>
+              <w:top w:val="single" w:color="999999" w:sz="4"/>
+              <w:left w:val="single" w:color="999999" w:sz="4"/>
+              <w:bottom w:val="single" w:color="999999" w:sz="4"/>
+              <w:right w:val="single" w:color="999999" w:sz="4"/>
+            </w:tcBorders>
+          </w:tcPr>
+          <w:p>
+            <w:r>
+              <w:rPr>
+                <w:b/>
+                <w:bCs/>
+                <w:sz w:val="18"/>
+                <w:szCs w:val="18"/>
+                <w:rFonts w:ascii="Calibri" w:cs="Calibri" w:eastAsia="Calibri" w:hAnsi="Calibri"/>
+              </w:rPr>
+              <w:t xml:space="preserve">Endpoint</w:t>
+            </w:r>
+          </w:p>
+        </w:tc>
+        <w:tc>
+          <w:tcPr>
+            <w:tcW w:type="dxa" w:w="6560"/>
+            <w:tcBorders>
+              <w:top w:val="single" w:color="999999" w:sz="4"/>
+              <w:left w:val="single" w:color="999999" w:sz="4"/>
+              <w:bottom w:val="single" w:color="999999" w:sz="4"/>
+              <w:right w:val="single" w:color="999999" w:sz="4"/>
+            </w:tcBorders>
+          </w:tcPr>
+          <w:p>
+            <w:r>
+              <w:rPr>
+                <w:sz w:val="18"/>
+                <w:szCs w:val="18"/>
+                <w:rFonts w:ascii="Calibri" w:cs="Calibri" w:eastAsia="Calibri" w:hAnsi="Calibri"/>
+              </w:rPr>
+              <w:t xml:space="preserve">GET /api/admin/users?search=&amp;limit=&amp;cursor=</w:t>
+            </w:r>
+          </w:p>
+        </w:tc>
+      </w:tr>
+      <w:tr>
+        <w:tc>
+          <w:tcPr>
+            <w:tcW w:type="dxa" w:w="2800"/>
+            <w:tcBorders>
+              <w:top w:val="single" w:color="999999" w:sz="4"/>
+              <w:left w:val="single" w:color="999999" w:sz="4"/>
+              <w:bottom w:val="single" w:color="999999" w:sz="4"/>
+              <w:right w:val="single" w:color="999999" w:sz="4"/>
+            </w:tcBorders>
+          </w:tcPr>
+          <w:p>
+            <w:r>
+              <w:rPr>
+                <w:b/>
+                <w:bCs/>
+                <w:sz w:val="18"/>
+                <w:szCs w:val="18"/>
+                <w:rFonts w:ascii="Calibri" w:cs="Calibri" w:eastAsia="Calibri" w:hAnsi="Calibri"/>
+              </w:rPr>
+              <w:t xml:space="preserve">Auth / CSRF</w:t>
+            </w:r>
+          </w:p>
+        </w:tc>
+        <w:tc>
+          <w:tcPr>
+            <w:tcW w:type="dxa" w:w="6560"/>
+            <w:tcBorders>
+              <w:top w:val="single" w:color="999999" w:sz="4"/>
+              <w:left w:val="single" w:color="999999" w:sz="4"/>
+              <w:bottom w:val="single" w:color="999999" w:sz="4"/>
+              <w:right w:val="single" w:color="999999" w:sz="4"/>
+            </w:tcBorders>
+          </w:tcPr>
+          <w:p>
+            <w:r>
+              <w:rPr>
+                <w:sz w:val="18"/>
+                <w:szCs w:val="18"/>
+                <w:rFonts w:ascii="Calibri" w:cs="Calibri" w:eastAsia="Calibri" w:hAnsi="Calibri"/>
+              </w:rPr>
+              <w:t xml:space="preserve">users:read permission</w:t>
+            </w:r>
+          </w:p>
+        </w:tc>
+      </w:tr>
+    </w:tbl>
+    <w:p>
+      <w:pPr>
+        <w:pStyle w:val="Heading3"/>
+        <w:spacing w:before="200" w:after="80"/>
+      </w:pPr>
+      <w:r>
+        <w:rPr>
+          <w:b/>
+          <w:bCs/>
+          <w:sz w:val="22"/>
+          <w:szCs w:val="22"/>
+          <w:rFonts w:ascii="Calibri" w:cs="Calibri" w:eastAsia="Calibri" w:hAnsi="Calibri"/>
+        </w:rPr>
+        <w:t xml:space="preserve">Functions targeted</w:t>
+      </w:r>
+    </w:p>
+    <w:p>
+      <w:pPr>
+        <w:spacing w:after="40"/>
+      </w:pPr>
+      <w:r>
+        <w:rPr>
+          <w:sz w:val="20"/>
+          <w:szCs w:val="20"/>
+          <w:rFonts w:ascii="Calibri" w:cs="Calibri" w:eastAsia="Calibri" w:hAnsi="Calibri"/>
+        </w:rPr>
+        <w:t xml:space="preserve">• routes/admin.ts → GET "/users"</w:t>
+      </w:r>
+    </w:p>
+    <w:p>
+      <w:pPr>
+        <w:spacing w:after="40"/>
+      </w:pPr>
+      <w:r>
+        <w:rPr>
+          <w:sz w:val="20"/>
+          <w:szCs w:val="20"/>
+          <w:rFonts w:ascii="Calibri" w:cs="Calibri" w:eastAsia="Calibri" w:hAnsi="Calibri"/>
+        </w:rPr>
+        <w:t xml:space="preserve">• middleware/requirePermission.ts → requirePermission</w:t>
+      </w:r>
+    </w:p>
+    <w:p>
+      <w:pPr>
+        <w:spacing w:after="40"/>
+      </w:pPr>
+      <w:r>
+        <w:rPr>
+          <w:sz w:val="20"/>
+          <w:szCs w:val="20"/>
+          <w:rFonts w:ascii="Calibri" w:cs="Calibri" w:eastAsia="Calibri" w:hAnsi="Calibri"/>
+        </w:rPr>
+        <w:t xml:space="preserve">• services/authorization.service.ts → listUsersWithRoles</w:t>
+      </w:r>
+    </w:p>
+    <w:p>
+      <w:pPr>
+        <w:pStyle w:val="Heading3"/>
+        <w:spacing w:before="200" w:after="80"/>
+      </w:pPr>
+      <w:r>
+        <w:rPr>
+          <w:b/>
+          <w:bCs/>
+          <w:sz w:val="22"/>
+          <w:szCs w:val="22"/>
+          <w:rFonts w:ascii="Calibri" w:cs="Calibri" w:eastAsia="Calibri" w:hAnsi="Calibri"/>
+        </w:rPr>
+        <w:t xml:space="preserve">Request payload</w:t>
+      </w:r>
+    </w:p>
+    <w:p>
+      <w:pPr>
+        <w:spacing w:after="40"/>
+      </w:pPr>
+      <w:r>
+        <w:rPr>
+          <w:sz w:val="18"/>
+          <w:szCs w:val="18"/>
+          <w:rFonts w:ascii="Consolas" w:cs="Consolas" w:eastAsia="Consolas" w:hAnsi="Consolas"/>
+        </w:rPr>
+        <w:t xml:space="preserve">(no body)</w:t>
+      </w:r>
+    </w:p>
+    <w:p>
+      <w:pPr>
+        <w:pStyle w:val="Heading3"/>
+        <w:spacing w:before="200" w:after="80"/>
+      </w:pPr>
+      <w:r>
+        <w:rPr>
+          <w:b/>
+          <w:bCs/>
+          <w:sz w:val="22"/>
+          <w:szCs w:val="22"/>
+          <w:rFonts w:ascii="Calibri" w:cs="Calibri" w:eastAsia="Calibri" w:hAnsi="Calibri"/>
+        </w:rPr>
+        <w:t xml:space="preserve">Expected success output</w:t>
+      </w:r>
+    </w:p>
+    <w:p>
+      <w:pPr>
+        <w:spacing w:after="40"/>
+      </w:pPr>
+      <w:r>
+        <w:rPr>
+          <w:sz w:val="18"/>
+          <w:szCs w:val="18"/>
+          <w:rFonts w:ascii="Consolas" w:cs="Consolas" w:eastAsia="Consolas" w:hAnsi="Consolas"/>
+        </w:rPr>
+        <w:t xml:space="preserve">200</w:t>
+      </w:r>
+    </w:p>
+    <w:p>
+      <w:pPr>
+        <w:spacing w:after="40"/>
+      </w:pPr>
+      <w:r>
+        <w:rPr>
+          <w:sz w:val="18"/>
+          <w:szCs w:val="18"/>
+          <w:rFonts w:ascii="Consolas" w:cs="Consolas" w:eastAsia="Consolas" w:hAnsi="Consolas"/>
+        </w:rPr>
+        <w:t xml:space="preserve">{</w:t>
+      </w:r>
+    </w:p>
+    <w:p>
+      <w:pPr>
+        <w:spacing w:after="40"/>
+      </w:pPr>
+      <w:r>
+        <w:rPr>
+          <w:sz w:val="18"/>
+          <w:szCs w:val="18"/>
+          <w:rFonts w:ascii="Consolas" w:cs="Consolas" w:eastAsia="Consolas" w:hAnsi="Consolas"/>
+        </w:rPr>
+        <w:t xml:space="preserve">  "users": [</w:t>
+      </w:r>
+    </w:p>
+    <w:p>
+      <w:pPr>
+        <w:spacing w:after="40"/>
+      </w:pPr>
+      <w:r>
+        <w:rPr>
+          <w:sz w:val="18"/>
+          <w:szCs w:val="18"/>
+          <w:rFonts w:ascii="Consolas" w:cs="Consolas" w:eastAsia="Consolas" w:hAnsi="Consolas"/>
+        </w:rPr>
+        <w:t xml:space="preserve">    {</w:t>
+      </w:r>
+    </w:p>
+    <w:p>
+      <w:pPr>
+        <w:spacing w:after="40"/>
+      </w:pPr>
+      <w:r>
+        <w:rPr>
+          <w:sz w:val="18"/>
+          <w:szCs w:val="18"/>
+          <w:rFonts w:ascii="Consolas" w:cs="Consolas" w:eastAsia="Consolas" w:hAnsi="Consolas"/>
+        </w:rPr>
+        <w:t xml:space="preserve">      "id": "uuid",</w:t>
+      </w:r>
+    </w:p>
+    <w:p>
+      <w:pPr>
+        <w:spacing w:after="40"/>
+      </w:pPr>
+      <w:r>
+        <w:rPr>
+          <w:sz w:val="18"/>
+          <w:szCs w:val="18"/>
+          <w:rFonts w:ascii="Consolas" w:cs="Consolas" w:eastAsia="Consolas" w:hAnsi="Consolas"/>
+        </w:rPr>
+        <w:t xml:space="preserve">      "email": "user@example.com",</w:t>
+      </w:r>
+    </w:p>
+    <w:p>
+      <w:pPr>
+        <w:spacing w:after="40"/>
+      </w:pPr>
+      <w:r>
+        <w:rPr>
+          <w:sz w:val="18"/>
+          <w:szCs w:val="18"/>
+          <w:rFonts w:ascii="Consolas" w:cs="Consolas" w:eastAsia="Consolas" w:hAnsi="Consolas"/>
+        </w:rPr>
+        <w:t xml:space="preserve">      "roles": ["user", "support"],</w:t>
+      </w:r>
+    </w:p>
+    <w:p>
+      <w:pPr>
+        <w:spacing w:after="40"/>
+      </w:pPr>
+      <w:r>
+        <w:rPr>
+          <w:sz w:val="18"/>
+          <w:szCs w:val="18"/>
+          <w:rFonts w:ascii="Consolas" w:cs="Consolas" w:eastAsia="Consolas" w:hAnsi="Consolas"/>
+        </w:rPr>
+        <w:t xml:space="preserve">      "createdAt": "2026-09-30T10:00:00.000Z"</w:t>
+      </w:r>
+    </w:p>
+    <w:p>
+      <w:pPr>
+        <w:spacing w:after="40"/>
+      </w:pPr>
+      <w:r>
+        <w:rPr>
+          <w:sz w:val="18"/>
+          <w:szCs w:val="18"/>
+          <w:rFonts w:ascii="Consolas" w:cs="Consolas" w:eastAsia="Consolas" w:hAnsi="Consolas"/>
+        </w:rPr>
+        <w:t xml:space="preserve">    }</w:t>
+      </w:r>
+    </w:p>
+    <w:p>
+      <w:pPr>
+        <w:spacing w:after="40"/>
+      </w:pPr>
+      <w:r>
+        <w:rPr>
+          <w:sz w:val="18"/>
+          <w:szCs w:val="18"/>
+          <w:rFonts w:ascii="Consolas" w:cs="Consolas" w:eastAsia="Consolas" w:hAnsi="Consolas"/>
+        </w:rPr>
+        <w:t xml:space="preserve">  ],</w:t>
+      </w:r>
+    </w:p>
+    <w:p>
+      <w:pPr>
+        <w:spacing w:after="40"/>
+      </w:pPr>
+      <w:r>
+        <w:rPr>
+          <w:sz w:val="18"/>
+          <w:szCs w:val="18"/>
+          <w:rFonts w:ascii="Consolas" w:cs="Consolas" w:eastAsia="Consolas" w:hAnsi="Consolas"/>
+        </w:rPr>
+        <w:t xml:space="preserve">  "nextCursor": null</w:t>
+      </w:r>
+    </w:p>
+    <w:p>
+      <w:pPr>
+        <w:spacing w:after="40"/>
+      </w:pPr>
+      <w:r>
+        <w:rPr>
+          <w:sz w:val="18"/>
+          <w:szCs w:val="18"/>
+          <w:rFonts w:ascii="Consolas" w:cs="Consolas" w:eastAsia="Consolas" w:hAnsi="Consolas"/>
+        </w:rPr>
+        <w:t xml:space="preserve">}</w:t>
+      </w:r>
+    </w:p>
+    <w:p>
+      <w:pPr>
+        <w:pStyle w:val="Heading3"/>
+        <w:spacing w:before="200" w:after="80"/>
+      </w:pPr>
+      <w:r>
+        <w:rPr>
+          <w:b/>
+          <w:bCs/>
+          <w:sz w:val="22"/>
+          <w:szCs w:val="22"/>
+          <w:rFonts w:ascii="Calibri" w:cs="Calibri" w:eastAsia="Calibri" w:hAnsi="Calibri"/>
+        </w:rPr>
+        <w:t xml:space="preserve">Expected error outputs</w:t>
+      </w:r>
+    </w:p>
+    <w:p>
+      <w:pPr>
+        <w:spacing w:after="40"/>
+      </w:pPr>
+      <w:r>
+        <w:rPr>
+          <w:sz w:val="20"/>
+          <w:szCs w:val="20"/>
+          <w:rFonts w:ascii="Calibri" w:cs="Calibri" w:eastAsia="Calibri" w:hAnsi="Calibri"/>
+        </w:rPr>
+        <w:t xml:space="preserve">• 400 { "error": "Invalid user query", "code": "INVALID_USER_QUERY" }</w:t>
+      </w:r>
+    </w:p>
+    <w:p>
+      <w:pPr>
+        <w:spacing w:after="40"/>
+      </w:pPr>
+      <w:r>
+        <w:rPr>
+          <w:sz w:val="20"/>
+          <w:szCs w:val="20"/>
+          <w:rFonts w:ascii="Calibri" w:cs="Calibri" w:eastAsia="Calibri" w:hAnsi="Calibri"/>
+        </w:rPr>
+        <w:t xml:space="preserve">• 403 { "error": "Required permission is missing", "code": "FORBIDDEN" }</w:t>
+      </w:r>
+    </w:p>
+    <w:p>
+      <w:pPr>
+        <w:pStyle w:val="Heading2"/>
+        <w:spacing w:before="280" w:after="120"/>
+      </w:pPr>
+      <w:r>
+        <w:rPr>
+          <w:b/>
+          <w:bCs/>
+          <w:sz w:val="24"/>
+          <w:szCs w:val="24"/>
+          <w:rFonts w:ascii="Calibri" w:cs="Calibri" w:eastAsia="Calibri" w:hAnsi="Calibri"/>
+        </w:rPr>
+        <w:t xml:space="preserve">17. Fixed roles (list)</w:t>
+      </w:r>
+    </w:p>
+    <w:p>
+      <w:pPr>
+        <w:spacing w:after="80"/>
+      </w:pPr>
+      <w:r>
+        <w:rPr>
+          <w:sz w:val="20"/>
+          <w:szCs w:val="20"/>
+          <w:rFonts w:ascii="Calibri" w:cs="Calibri" w:eastAsia="Calibri" w:hAnsi="Calibri"/>
+        </w:rPr>
+        <w:t xml:space="preserve">Returns migration-owned role definitions and their permission bundles.</w:t>
+      </w:r>
+    </w:p>
+    <w:tbl>
+      <w:tblPr>
+        <w:tblW w:type="dxa" w:w="9360"/>
+        <w:tblBorders>
+          <w:top w:val="single" w:color="auto" w:sz="4"/>
+          <w:left w:val="single" w:color="auto" w:sz="4"/>
+          <w:bottom w:val="single" w:color="auto" w:sz="4"/>
+          <w:right w:val="single" w:color="auto" w:sz="4"/>
+          <w:insideH w:val="single" w:color="auto" w:sz="4"/>
+          <w:insideV w:val="single" w:color="auto" w:sz="4"/>
+        </w:tblBorders>
+      </w:tblPr>
+      <w:tblGrid>
+        <w:gridCol w:w="2800"/>
+        <w:gridCol w:w="6560"/>
+      </w:tblGrid>
+      <w:tr>
+        <w:tc>
+          <w:tcPr>
+            <w:tcW w:type="dxa" w:w="2800"/>
+            <w:tcBorders>
+              <w:top w:val="single" w:color="999999" w:sz="4"/>
+              <w:left w:val="single" w:color="999999" w:sz="4"/>
+              <w:bottom w:val="single" w:color="999999" w:sz="4"/>
+              <w:right w:val="single" w:color="999999" w:sz="4"/>
+            </w:tcBorders>
+          </w:tcPr>
+          <w:p>
+            <w:r>
+              <w:rPr>
+                <w:b/>
+                <w:bCs/>
+                <w:sz w:val="18"/>
+                <w:szCs w:val="18"/>
+                <w:rFonts w:ascii="Calibri" w:cs="Calibri" w:eastAsia="Calibri" w:hAnsi="Calibri"/>
+              </w:rPr>
+              <w:t xml:space="preserve">Endpoint</w:t>
+            </w:r>
+          </w:p>
+        </w:tc>
+        <w:tc>
+          <w:tcPr>
+            <w:tcW w:type="dxa" w:w="6560"/>
+            <w:tcBorders>
+              <w:top w:val="single" w:color="999999" w:sz="4"/>
+              <w:left w:val="single" w:color="999999" w:sz="4"/>
+              <w:bottom w:val="single" w:color="999999" w:sz="4"/>
+              <w:right w:val="single" w:color="999999" w:sz="4"/>
+            </w:tcBorders>
+          </w:tcPr>
+          <w:p>
+            <w:r>
+              <w:rPr>
+                <w:sz w:val="18"/>
+                <w:szCs w:val="18"/>
+                <w:rFonts w:ascii="Calibri" w:cs="Calibri" w:eastAsia="Calibri" w:hAnsi="Calibri"/>
+              </w:rPr>
+              <w:t xml:space="preserve">GET /api/admin/roles</w:t>
+            </w:r>
+          </w:p>
+        </w:tc>
+      </w:tr>
+      <w:tr>
+        <w:tc>
+          <w:tcPr>
+            <w:tcW w:type="dxa" w:w="2800"/>
+            <w:tcBorders>
+              <w:top w:val="single" w:color="999999" w:sz="4"/>
+              <w:left w:val="single" w:color="999999" w:sz="4"/>
+              <w:bottom w:val="single" w:color="999999" w:sz="4"/>
+              <w:right w:val="single" w:color="999999" w:sz="4"/>
+            </w:tcBorders>
+          </w:tcPr>
+          <w:p>
+            <w:r>
+              <w:rPr>
+                <w:b/>
+                <w:bCs/>
+                <w:sz w:val="18"/>
+                <w:szCs w:val="18"/>
+                <w:rFonts w:ascii="Calibri" w:cs="Calibri" w:eastAsia="Calibri" w:hAnsi="Calibri"/>
+              </w:rPr>
+              <w:t xml:space="preserve">Auth / CSRF</w:t>
+            </w:r>
+          </w:p>
+        </w:tc>
+        <w:tc>
+          <w:tcPr>
+            <w:tcW w:type="dxa" w:w="6560"/>
+            <w:tcBorders>
+              <w:top w:val="single" w:color="999999" w:sz="4"/>
+              <w:left w:val="single" w:color="999999" w:sz="4"/>
+              <w:bottom w:val="single" w:color="999999" w:sz="4"/>
+              <w:right w:val="single" w:color="999999" w:sz="4"/>
+            </w:tcBorders>
+          </w:tcPr>
+          <w:p>
+            <w:r>
+              <w:rPr>
+                <w:sz w:val="18"/>
+                <w:szCs w:val="18"/>
+                <w:rFonts w:ascii="Calibri" w:cs="Calibri" w:eastAsia="Calibri" w:hAnsi="Calibri"/>
+              </w:rPr>
+              <w:t xml:space="preserve">users:roles:update permission</w:t>
+            </w:r>
+          </w:p>
+        </w:tc>
+      </w:tr>
+    </w:tbl>
+    <w:p>
+      <w:pPr>
+        <w:pStyle w:val="Heading3"/>
+        <w:spacing w:before="200" w:after="80"/>
+      </w:pPr>
+      <w:r>
+        <w:rPr>
+          <w:b/>
+          <w:bCs/>
+          <w:sz w:val="22"/>
+          <w:szCs w:val="22"/>
+          <w:rFonts w:ascii="Calibri" w:cs="Calibri" w:eastAsia="Calibri" w:hAnsi="Calibri"/>
+        </w:rPr>
+        <w:t xml:space="preserve">Functions targeted</w:t>
+      </w:r>
+    </w:p>
+    <w:p>
+      <w:pPr>
+        <w:spacing w:after="40"/>
+      </w:pPr>
+      <w:r>
+        <w:rPr>
+          <w:sz w:val="20"/>
+          <w:szCs w:val="20"/>
+          <w:rFonts w:ascii="Calibri" w:cs="Calibri" w:eastAsia="Calibri" w:hAnsi="Calibri"/>
+        </w:rPr>
+        <w:t xml:space="preserve">• routes/admin.ts → GET "/roles"</w:t>
+      </w:r>
+    </w:p>
+    <w:p>
+      <w:pPr>
+        <w:spacing w:after="40"/>
+      </w:pPr>
+      <w:r>
+        <w:rPr>
+          <w:sz w:val="20"/>
+          <w:szCs w:val="20"/>
+          <w:rFonts w:ascii="Calibri" w:cs="Calibri" w:eastAsia="Calibri" w:hAnsi="Calibri"/>
+        </w:rPr>
+        <w:t xml:space="preserve">• services/authorization.service.ts → listRoles</w:t>
+      </w:r>
+    </w:p>
+    <w:p>
+      <w:pPr>
+        <w:pStyle w:val="Heading3"/>
+        <w:spacing w:before="200" w:after="80"/>
+      </w:pPr>
+      <w:r>
+        <w:rPr>
+          <w:b/>
+          <w:bCs/>
+          <w:sz w:val="22"/>
+          <w:szCs w:val="22"/>
+          <w:rFonts w:ascii="Calibri" w:cs="Calibri" w:eastAsia="Calibri" w:hAnsi="Calibri"/>
+        </w:rPr>
+        <w:t xml:space="preserve">Request payload</w:t>
+      </w:r>
+    </w:p>
+    <w:p>
+      <w:pPr>
+        <w:spacing w:after="40"/>
+      </w:pPr>
+      <w:r>
+        <w:rPr>
+          <w:sz w:val="18"/>
+          <w:szCs w:val="18"/>
+          <w:rFonts w:ascii="Consolas" w:cs="Consolas" w:eastAsia="Consolas" w:hAnsi="Consolas"/>
+        </w:rPr>
+        <w:t xml:space="preserve">(no body)</w:t>
+      </w:r>
+    </w:p>
+    <w:p>
+      <w:pPr>
+        <w:pStyle w:val="Heading3"/>
+        <w:spacing w:before="200" w:after="80"/>
+      </w:pPr>
+      <w:r>
+        <w:rPr>
+          <w:b/>
+          <w:bCs/>
+          <w:sz w:val="22"/>
+          <w:szCs w:val="22"/>
+          <w:rFonts w:ascii="Calibri" w:cs="Calibri" w:eastAsia="Calibri" w:hAnsi="Calibri"/>
+        </w:rPr>
+        <w:t xml:space="preserve">Expected success output</w:t>
+      </w:r>
+    </w:p>
+    <w:p>
+      <w:pPr>
+        <w:spacing w:after="40"/>
+      </w:pPr>
+      <w:r>
+        <w:rPr>
+          <w:sz w:val="18"/>
+          <w:szCs w:val="18"/>
+          <w:rFonts w:ascii="Consolas" w:cs="Consolas" w:eastAsia="Consolas" w:hAnsi="Consolas"/>
+        </w:rPr>
+        <w:t xml:space="preserve">200</w:t>
+      </w:r>
+    </w:p>
+    <w:p>
+      <w:pPr>
+        <w:spacing w:after="40"/>
+      </w:pPr>
+      <w:r>
+        <w:rPr>
+          <w:sz w:val="18"/>
+          <w:szCs w:val="18"/>
+          <w:rFonts w:ascii="Consolas" w:cs="Consolas" w:eastAsia="Consolas" w:hAnsi="Consolas"/>
+        </w:rPr>
+        <w:t xml:space="preserve">{</w:t>
+      </w:r>
+    </w:p>
+    <w:p>
+      <w:pPr>
+        <w:spacing w:after="40"/>
+      </w:pPr>
+      <w:r>
+        <w:rPr>
+          <w:sz w:val="18"/>
+          <w:szCs w:val="18"/>
+          <w:rFonts w:ascii="Consolas" w:cs="Consolas" w:eastAsia="Consolas" w:hAnsi="Consolas"/>
+        </w:rPr>
+        <w:t xml:space="preserve">  "roles": [</w:t>
+      </w:r>
+    </w:p>
+    <w:p>
+      <w:pPr>
+        <w:spacing w:after="40"/>
+      </w:pPr>
+      <w:r>
+        <w:rPr>
+          <w:sz w:val="18"/>
+          <w:szCs w:val="18"/>
+          <w:rFonts w:ascii="Consolas" w:cs="Consolas" w:eastAsia="Consolas" w:hAnsi="Consolas"/>
+        </w:rPr>
+        <w:t xml:space="preserve">    {</w:t>
+      </w:r>
+    </w:p>
+    <w:p>
+      <w:pPr>
+        <w:spacing w:after="40"/>
+      </w:pPr>
+      <w:r>
+        <w:rPr>
+          <w:sz w:val="18"/>
+          <w:szCs w:val="18"/>
+          <w:rFonts w:ascii="Consolas" w:cs="Consolas" w:eastAsia="Consolas" w:hAnsi="Consolas"/>
+        </w:rPr>
+        <w:t xml:space="preserve">      "key": "administrator",</w:t>
+      </w:r>
+    </w:p>
+    <w:p>
+      <w:pPr>
+        <w:spacing w:after="40"/>
+      </w:pPr>
+      <w:r>
+        <w:rPr>
+          <w:sz w:val="18"/>
+          <w:szCs w:val="18"/>
+          <w:rFonts w:ascii="Consolas" w:cs="Consolas" w:eastAsia="Consolas" w:hAnsi="Consolas"/>
+        </w:rPr>
+        <w:t xml:space="preserve">      "name": "Administrator",</w:t>
+      </w:r>
+    </w:p>
+    <w:p>
+      <w:pPr>
+        <w:spacing w:after="40"/>
+      </w:pPr>
+      <w:r>
+        <w:rPr>
+          <w:sz w:val="18"/>
+          <w:szCs w:val="18"/>
+          <w:rFonts w:ascii="Consolas" w:cs="Consolas" w:eastAsia="Consolas" w:hAnsi="Consolas"/>
+        </w:rPr>
+        <w:t xml:space="preserve">      "description": "Full application administration",</w:t>
+      </w:r>
+    </w:p>
+    <w:p>
+      <w:pPr>
+        <w:spacing w:after="40"/>
+      </w:pPr>
+      <w:r>
+        <w:rPr>
+          <w:sz w:val="18"/>
+          <w:szCs w:val="18"/>
+          <w:rFonts w:ascii="Consolas" w:cs="Consolas" w:eastAsia="Consolas" w:hAnsi="Consolas"/>
+        </w:rPr>
+        <w:t xml:space="preserve">      "permissions": ["settings:read", "settings:update", "users:read", "users:roles:update"]</w:t>
+      </w:r>
+    </w:p>
+    <w:p>
+      <w:pPr>
+        <w:spacing w:after="40"/>
+      </w:pPr>
+      <w:r>
+        <w:rPr>
+          <w:sz w:val="18"/>
+          <w:szCs w:val="18"/>
+          <w:rFonts w:ascii="Consolas" w:cs="Consolas" w:eastAsia="Consolas" w:hAnsi="Consolas"/>
+        </w:rPr>
+        <w:t xml:space="preserve">    }</w:t>
+      </w:r>
+    </w:p>
+    <w:p>
+      <w:pPr>
+        <w:spacing w:after="40"/>
+      </w:pPr>
+      <w:r>
+        <w:rPr>
+          <w:sz w:val="18"/>
+          <w:szCs w:val="18"/>
+          <w:rFonts w:ascii="Consolas" w:cs="Consolas" w:eastAsia="Consolas" w:hAnsi="Consolas"/>
+        </w:rPr>
+        <w:t xml:space="preserve">  ]</w:t>
+      </w:r>
+    </w:p>
+    <w:p>
+      <w:pPr>
+        <w:spacing w:after="40"/>
+      </w:pPr>
+      <w:r>
+        <w:rPr>
+          <w:sz w:val="18"/>
+          <w:szCs w:val="18"/>
+          <w:rFonts w:ascii="Consolas" w:cs="Consolas" w:eastAsia="Consolas" w:hAnsi="Consolas"/>
+        </w:rPr>
+        <w:t xml:space="preserve">}</w:t>
+      </w:r>
+    </w:p>
+    <w:p>
+      <w:pPr>
+        <w:pStyle w:val="Heading3"/>
+        <w:spacing w:before="200" w:after="80"/>
+      </w:pPr>
+      <w:r>
+        <w:rPr>
+          <w:b/>
+          <w:bCs/>
+          <w:sz w:val="22"/>
+          <w:szCs w:val="22"/>
+          <w:rFonts w:ascii="Calibri" w:cs="Calibri" w:eastAsia="Calibri" w:hAnsi="Calibri"/>
+        </w:rPr>
+        <w:t xml:space="preserve">Expected error outputs</w:t>
+      </w:r>
+    </w:p>
+    <w:p>
+      <w:pPr>
+        <w:spacing w:after="40"/>
+      </w:pPr>
+      <w:r>
+        <w:rPr>
+          <w:sz w:val="20"/>
+          <w:szCs w:val="20"/>
+          <w:rFonts w:ascii="Calibri" w:cs="Calibri" w:eastAsia="Calibri" w:hAnsi="Calibri"/>
+        </w:rPr>
+        <w:t xml:space="preserve">• 403 { "error": "Required permission is missing", "code": "FORBIDDEN" }</w:t>
+      </w:r>
+    </w:p>
+    <w:p>
+      <w:pPr>
+        <w:pStyle w:val="Heading2"/>
+        <w:spacing w:before="280" w:after="120"/>
+      </w:pPr>
+      <w:r>
+        <w:rPr>
+          <w:b/>
+          <w:bCs/>
+          <w:sz w:val="24"/>
+          <w:szCs w:val="24"/>
+          <w:rFonts w:ascii="Calibri" w:cs="Calibri" w:eastAsia="Calibri" w:hAnsi="Calibri"/>
+        </w:rPr>
+        <w:t xml:space="preserve">18. User roles (replace)</w:t>
+      </w:r>
+    </w:p>
+    <w:p>
+      <w:pPr>
+        <w:spacing w:after="80"/>
+      </w:pPr>
+      <w:r>
+        <w:rPr>
+          <w:sz w:val="20"/>
+          <w:szCs w:val="20"/>
+          <w:rFonts w:ascii="Calibri" w:cs="Calibri" w:eastAsia="Calibri" w:hAnsi="Calibri"/>
+        </w:rPr>
+        <w:t xml:space="preserve">Atomically replaces a user's fixed roles while retaining the base user role and preventing administrator lockout.</w:t>
+      </w:r>
+    </w:p>
+    <w:tbl>
+      <w:tblPr>
+        <w:tblW w:type="dxa" w:w="9360"/>
+        <w:tblBorders>
+          <w:top w:val="single" w:color="auto" w:sz="4"/>
+          <w:left w:val="single" w:color="auto" w:sz="4"/>
+          <w:bottom w:val="single" w:color="auto" w:sz="4"/>
+          <w:right w:val="single" w:color="auto" w:sz="4"/>
+          <w:insideH w:val="single" w:color="auto" w:sz="4"/>
+          <w:insideV w:val="single" w:color="auto" w:sz="4"/>
+        </w:tblBorders>
+      </w:tblPr>
+      <w:tblGrid>
+        <w:gridCol w:w="2800"/>
+        <w:gridCol w:w="6560"/>
+      </w:tblGrid>
+      <w:tr>
+        <w:tc>
+          <w:tcPr>
+            <w:tcW w:type="dxa" w:w="2800"/>
+            <w:tcBorders>
+              <w:top w:val="single" w:color="999999" w:sz="4"/>
+              <w:left w:val="single" w:color="999999" w:sz="4"/>
+              <w:bottom w:val="single" w:color="999999" w:sz="4"/>
+              <w:right w:val="single" w:color="999999" w:sz="4"/>
+            </w:tcBorders>
+          </w:tcPr>
+          <w:p>
+            <w:r>
+              <w:rPr>
+                <w:b/>
+                <w:bCs/>
+                <w:sz w:val="18"/>
+                <w:szCs w:val="18"/>
+                <w:rFonts w:ascii="Calibri" w:cs="Calibri" w:eastAsia="Calibri" w:hAnsi="Calibri"/>
+              </w:rPr>
+              <w:t xml:space="preserve">Endpoint</w:t>
+            </w:r>
+          </w:p>
+        </w:tc>
+        <w:tc>
+          <w:tcPr>
+            <w:tcW w:type="dxa" w:w="6560"/>
+            <w:tcBorders>
+              <w:top w:val="single" w:color="999999" w:sz="4"/>
+              <w:left w:val="single" w:color="999999" w:sz="4"/>
+              <w:bottom w:val="single" w:color="999999" w:sz="4"/>
+              <w:right w:val="single" w:color="999999" w:sz="4"/>
+            </w:tcBorders>
+          </w:tcPr>
+          <w:p>
+            <w:r>
+              <w:rPr>
+                <w:sz w:val="18"/>
+                <w:szCs w:val="18"/>
+                <w:rFonts w:ascii="Calibri" w:cs="Calibri" w:eastAsia="Calibri" w:hAnsi="Calibri"/>
+              </w:rPr>
+              <w:t xml:space="preserve">PUT /api/admin/users/:userId/roles</w:t>
+            </w:r>
+          </w:p>
+        </w:tc>
+      </w:tr>
+      <w:tr>
+        <w:tc>
+          <w:tcPr>
+            <w:tcW w:type="dxa" w:w="2800"/>
+            <w:tcBorders>
+              <w:top w:val="single" w:color="999999" w:sz="4"/>
+              <w:left w:val="single" w:color="999999" w:sz="4"/>
+              <w:bottom w:val="single" w:color="999999" w:sz="4"/>
+              <w:right w:val="single" w:color="999999" w:sz="4"/>
+            </w:tcBorders>
+          </w:tcPr>
+          <w:p>
+            <w:r>
+              <w:rPr>
+                <w:b/>
+                <w:bCs/>
+                <w:sz w:val="18"/>
+                <w:szCs w:val="18"/>
+                <w:rFonts w:ascii="Calibri" w:cs="Calibri" w:eastAsia="Calibri" w:hAnsi="Calibri"/>
+              </w:rPr>
+              <w:t xml:space="preserve">Auth / CSRF</w:t>
+            </w:r>
+          </w:p>
+        </w:tc>
+        <w:tc>
+          <w:tcPr>
+            <w:tcW w:type="dxa" w:w="6560"/>
+            <w:tcBorders>
+              <w:top w:val="single" w:color="999999" w:sz="4"/>
+              <w:left w:val="single" w:color="999999" w:sz="4"/>
+              <w:bottom w:val="single" w:color="999999" w:sz="4"/>
+              <w:right w:val="single" w:color="999999" w:sz="4"/>
+            </w:tcBorders>
+          </w:tcPr>
+          <w:p>
+            <w:r>
+              <w:rPr>
+                <w:sz w:val="18"/>
+                <w:szCs w:val="18"/>
+                <w:rFonts w:ascii="Calibri" w:cs="Calibri" w:eastAsia="Calibri" w:hAnsi="Calibri"/>
+              </w:rPr>
+              <w:t xml:space="preserve">users:roles:update permission + CSRF + recent auth</w:t>
+            </w:r>
+          </w:p>
+        </w:tc>
+      </w:tr>
+    </w:tbl>
+    <w:p>
+      <w:pPr>
+        <w:pStyle w:val="Heading3"/>
+        <w:spacing w:before="200" w:after="80"/>
+      </w:pPr>
+      <w:r>
+        <w:rPr>
+          <w:b/>
+          <w:bCs/>
+          <w:sz w:val="22"/>
+          <w:szCs w:val="22"/>
+          <w:rFonts w:ascii="Calibri" w:cs="Calibri" w:eastAsia="Calibri" w:hAnsi="Calibri"/>
+        </w:rPr>
+        <w:t xml:space="preserve">Functions targeted</w:t>
+      </w:r>
+    </w:p>
+    <w:p>
+      <w:pPr>
+        <w:spacing w:after="40"/>
+      </w:pPr>
+      <w:r>
+        <w:rPr>
+          <w:sz w:val="20"/>
+          <w:szCs w:val="20"/>
+          <w:rFonts w:ascii="Calibri" w:cs="Calibri" w:eastAsia="Calibri" w:hAnsi="Calibri"/>
+        </w:rPr>
+        <w:t xml:space="preserve">• routes/admin.ts → PUT "/users/:userId/roles"</w:t>
+      </w:r>
+    </w:p>
+    <w:p>
+      <w:pPr>
+        <w:spacing w:after="40"/>
+      </w:pPr>
+      <w:r>
+        <w:rPr>
+          <w:sz w:val="20"/>
+          <w:szCs w:val="20"/>
+          <w:rFonts w:ascii="Calibri" w:cs="Calibri" w:eastAsia="Calibri" w:hAnsi="Calibri"/>
+        </w:rPr>
+        <w:t xml:space="preserve">• services/authorization.service.ts → replaceUserRoles</w:t>
+      </w:r>
+    </w:p>
+    <w:p>
+      <w:pPr>
+        <w:pStyle w:val="Heading3"/>
+        <w:spacing w:before="200" w:after="80"/>
+      </w:pPr>
+      <w:r>
+        <w:rPr>
+          <w:b/>
+          <w:bCs/>
+          <w:sz w:val="22"/>
+          <w:szCs w:val="22"/>
+          <w:rFonts w:ascii="Calibri" w:cs="Calibri" w:eastAsia="Calibri" w:hAnsi="Calibri"/>
+        </w:rPr>
+        <w:t xml:space="preserve">Request payload</w:t>
+      </w:r>
+    </w:p>
+    <w:p>
+      <w:pPr>
+        <w:spacing w:after="40"/>
+      </w:pPr>
+      <w:r>
+        <w:rPr>
+          <w:sz w:val="18"/>
+          <w:szCs w:val="18"/>
+          <w:rFonts w:ascii="Consolas" w:cs="Consolas" w:eastAsia="Consolas" w:hAnsi="Consolas"/>
+        </w:rPr>
+        <w:t xml:space="preserve">{</w:t>
+      </w:r>
+    </w:p>
+    <w:p>
+      <w:pPr>
+        <w:spacing w:after="40"/>
+      </w:pPr>
+      <w:r>
+        <w:rPr>
+          <w:sz w:val="18"/>
+          <w:szCs w:val="18"/>
+          <w:rFonts w:ascii="Consolas" w:cs="Consolas" w:eastAsia="Consolas" w:hAnsi="Consolas"/>
+        </w:rPr>
+        <w:t xml:space="preserve">  "roleKeys": ["user", "settings-manager"]</w:t>
+      </w:r>
+    </w:p>
+    <w:p>
+      <w:pPr>
+        <w:spacing w:after="40"/>
+      </w:pPr>
+      <w:r>
+        <w:rPr>
+          <w:sz w:val="18"/>
+          <w:szCs w:val="18"/>
+          <w:rFonts w:ascii="Consolas" w:cs="Consolas" w:eastAsia="Consolas" w:hAnsi="Consolas"/>
+        </w:rPr>
+        <w:t xml:space="preserve">}</w:t>
+      </w:r>
+    </w:p>
+    <w:p>
+      <w:pPr>
+        <w:pStyle w:val="Heading3"/>
+        <w:spacing w:before="200" w:after="80"/>
+      </w:pPr>
+      <w:r>
+        <w:rPr>
+          <w:b/>
+          <w:bCs/>
+          <w:sz w:val="22"/>
+          <w:szCs w:val="22"/>
+          <w:rFonts w:ascii="Calibri" w:cs="Calibri" w:eastAsia="Calibri" w:hAnsi="Calibri"/>
+        </w:rPr>
+        <w:t xml:space="preserve">Expected success output</w:t>
+      </w:r>
+    </w:p>
+    <w:p>
+      <w:pPr>
+        <w:spacing w:after="40"/>
+      </w:pPr>
+      <w:r>
+        <w:rPr>
+          <w:sz w:val="18"/>
+          <w:szCs w:val="18"/>
+          <w:rFonts w:ascii="Consolas" w:cs="Consolas" w:eastAsia="Consolas" w:hAnsi="Consolas"/>
+        </w:rPr>
+        <w:t xml:space="preserve">200</w:t>
+      </w:r>
+    </w:p>
+    <w:p>
+      <w:pPr>
+        <w:spacing w:after="40"/>
+      </w:pPr>
+      <w:r>
+        <w:rPr>
+          <w:sz w:val="18"/>
+          <w:szCs w:val="18"/>
+          <w:rFonts w:ascii="Consolas" w:cs="Consolas" w:eastAsia="Consolas" w:hAnsi="Consolas"/>
+        </w:rPr>
+        <w:t xml:space="preserve">{</w:t>
+      </w:r>
+    </w:p>
+    <w:p>
+      <w:pPr>
+        <w:spacing w:after="40"/>
+      </w:pPr>
+      <w:r>
+        <w:rPr>
+          <w:sz w:val="18"/>
+          <w:szCs w:val="18"/>
+          <w:rFonts w:ascii="Consolas" w:cs="Consolas" w:eastAsia="Consolas" w:hAnsi="Consolas"/>
+        </w:rPr>
+        <w:t xml:space="preserve">  "user": {</w:t>
+      </w:r>
+    </w:p>
+    <w:p>
+      <w:pPr>
+        <w:spacing w:after="40"/>
+      </w:pPr>
+      <w:r>
+        <w:rPr>
+          <w:sz w:val="18"/>
+          <w:szCs w:val="18"/>
+          <w:rFonts w:ascii="Consolas" w:cs="Consolas" w:eastAsia="Consolas" w:hAnsi="Consolas"/>
+        </w:rPr>
+        <w:t xml:space="preserve">    "id": "uuid",</w:t>
+      </w:r>
+    </w:p>
+    <w:p>
+      <w:pPr>
+        <w:spacing w:after="40"/>
+      </w:pPr>
+      <w:r>
+        <w:rPr>
+          <w:sz w:val="18"/>
+          <w:szCs w:val="18"/>
+          <w:rFonts w:ascii="Consolas" w:cs="Consolas" w:eastAsia="Consolas" w:hAnsi="Consolas"/>
+        </w:rPr>
+        <w:t xml:space="preserve">    "email": "user@example.com",</w:t>
+      </w:r>
+    </w:p>
+    <w:p>
+      <w:pPr>
+        <w:spacing w:after="40"/>
+      </w:pPr>
+      <w:r>
+        <w:rPr>
+          <w:sz w:val="18"/>
+          <w:szCs w:val="18"/>
+          <w:rFonts w:ascii="Consolas" w:cs="Consolas" w:eastAsia="Consolas" w:hAnsi="Consolas"/>
+        </w:rPr>
+        <w:t xml:space="preserve">    "roles": ["settings-manager", "user"],</w:t>
+      </w:r>
+    </w:p>
+    <w:p>
+      <w:pPr>
+        <w:spacing w:after="40"/>
+      </w:pPr>
+      <w:r>
+        <w:rPr>
+          <w:sz w:val="18"/>
+          <w:szCs w:val="18"/>
+          <w:rFonts w:ascii="Consolas" w:cs="Consolas" w:eastAsia="Consolas" w:hAnsi="Consolas"/>
+        </w:rPr>
+        <w:t xml:space="preserve">    "permissions": ["settings:read", "settings:update"]</w:t>
+      </w:r>
+    </w:p>
+    <w:p>
+      <w:pPr>
+        <w:spacing w:after="40"/>
+      </w:pPr>
+      <w:r>
+        <w:rPr>
+          <w:sz w:val="18"/>
+          <w:szCs w:val="18"/>
+          <w:rFonts w:ascii="Consolas" w:cs="Consolas" w:eastAsia="Consolas" w:hAnsi="Consolas"/>
+        </w:rPr>
+        <w:t xml:space="preserve">  }</w:t>
+      </w:r>
+    </w:p>
+    <w:p>
+      <w:pPr>
+        <w:spacing w:after="40"/>
+      </w:pPr>
+      <w:r>
+        <w:rPr>
+          <w:sz w:val="18"/>
+          <w:szCs w:val="18"/>
+          <w:rFonts w:ascii="Consolas" w:cs="Consolas" w:eastAsia="Consolas" w:hAnsi="Consolas"/>
+        </w:rPr>
+        <w:t xml:space="preserve">}</w:t>
+      </w:r>
+    </w:p>
+    <w:p>
+      <w:pPr>
+        <w:pStyle w:val="Heading3"/>
+        <w:spacing w:before="200" w:after="80"/>
+      </w:pPr>
+      <w:r>
+        <w:rPr>
+          <w:b/>
+          <w:bCs/>
+          <w:sz w:val="22"/>
+          <w:szCs w:val="22"/>
+          <w:rFonts w:ascii="Calibri" w:cs="Calibri" w:eastAsia="Calibri" w:hAnsi="Calibri"/>
+        </w:rPr>
+        <w:t xml:space="preserve">Expected error outputs</w:t>
+      </w:r>
+    </w:p>
+    <w:p>
+      <w:pPr>
+        <w:spacing w:after="40"/>
+      </w:pPr>
+      <w:r>
+        <w:rPr>
+          <w:sz w:val="20"/>
+          <w:szCs w:val="20"/>
+          <w:rFonts w:ascii="Calibri" w:cs="Calibri" w:eastAsia="Calibri" w:hAnsi="Calibri"/>
+        </w:rPr>
+        <w:t xml:space="preserve">• 401 { "error": "Recent authentication required", "code": "RECENT_AUTH_REQUIRED" }</w:t>
+      </w:r>
+    </w:p>
+    <w:p>
+      <w:pPr>
+        <w:spacing w:after="40"/>
+      </w:pPr>
+      <w:r>
+        <w:rPr>
+          <w:sz w:val="20"/>
+          <w:szCs w:val="20"/>
+          <w:rFonts w:ascii="Calibri" w:cs="Calibri" w:eastAsia="Calibri" w:hAnsi="Calibri"/>
+        </w:rPr>
+        <w:t xml:space="preserve">• 400 { "error": "One or more roles are unknown", "code": "INVALID_ROLE_ASSIGNMENT" }</w:t>
+      </w:r>
+    </w:p>
+    <w:p>
+      <w:pPr>
+        <w:spacing w:after="40"/>
+      </w:pPr>
+      <w:r>
+        <w:rPr>
+          <w:sz w:val="20"/>
+          <w:szCs w:val="20"/>
+          <w:rFonts w:ascii="Calibri" w:cs="Calibri" w:eastAsia="Calibri" w:hAnsi="Calibri"/>
+        </w:rPr>
+        <w:t xml:space="preserve">• 409 { "error": "The final administrator cannot be removed", "code": "LAST_ADMINISTRATOR" }</w:t>
+      </w:r>
+    </w:p>
+    <w:p>
+      <w:pPr>
+        <w:spacing w:after="40"/>
+      </w:pPr>
+      <w:r>
+        <w:rPr>
+          <w:sz w:val="20"/>
+          <w:szCs w:val="20"/>
+          <w:rFonts w:ascii="Calibri" w:cs="Calibri" w:eastAsia="Calibri" w:hAnsi="Calibri"/>
+        </w:rPr>
+        <w:t xml:space="preserve">• 409 { "error": "Administrators cannot remove their own administrator role", "code": "SELF_DEMOTION_NOT_ALLOWED" }</w:t>
+      </w:r>
+    </w:p>
+    <w:p>
+      <w:pPr>
+        <w:pStyle w:val="Heading2"/>
+        <w:spacing w:before="280" w:after="120"/>
+      </w:pPr>
+      <w:r>
+        <w:rPr>
+          <w:b/>
+          <w:bCs/>
+          <w:sz w:val="24"/>
+          <w:szCs w:val="24"/>
+          <w:rFonts w:ascii="Calibri" w:cs="Calibri" w:eastAsia="Calibri" w:hAnsi="Calibri"/>
+        </w:rPr>
+        <w:t xml:space="preserve">19. Health check</w:t>
       </w:r>
     </w:p>
     <w:p>
@@ -6122,7 +7378,7 @@
           <w:szCs w:val="24"/>
           <w:rFonts w:ascii="Calibri" w:cs="Calibri" w:eastAsia="Calibri" w:hAnsi="Calibri"/>
         </w:rPr>
-        <w:t xml:space="preserve">17. Supporting security controls (cross-cutting)</w:t>
+        <w:t xml:space="preserve">20. Supporting security controls (cross-cutting)</w:t>
       </w:r>
     </w:p>
     <w:p>

</xml_diff>